<commit_message>
Production-ready LLM labeling and data-driven findings
- LLM back-end: parallel requests, retries with backoff, checkpointed cache in
  data/llm_cache.csv (reproducible without an API key), robust reply parsing
- README results, notebook observations and Final Report are now generated
  from the data, so they stay correct for any labeling method
</commit_message>
<xml_diff>
--- a/reports/Final_Report.docx
+++ b/reports/Final_Report.docx
@@ -12,7 +12,7 @@
     </w:p>
     <w:p>
       <w:r>
-        <w:t>Dataset: test.csv — 2,191 employee e-mails from 10 employees, 2010-01-01 to 2011-12-31 (24 months). All numbers below are generated from data/processed/ by src/report.py.</w:t>
+        <w:t>Dataset: test.csv — 2,191 employee e-mails from 10 employees, 2010-01-01 to 2011-12-31 (24 months). Sentiment labeling: VADER (lexicon + rule-based NLP model). All numbers and findings in this report are generated from the pipeline outputs (src/report.py).</w:t>
       </w:r>
     </w:p>
     <w:p>
@@ -25,42 +25,78 @@
     </w:p>
     <w:p>
       <w:pPr>
-        <w:pStyle w:val="ListBullet"/>
+        <w:pStyle w:val="ListNumber"/>
       </w:pPr>
       <w:r>
-        <w:t>Sentiment is predominantly positive: 1,573 positive (72%), 445 neutral (20%), 173 negative (8%).</w:t>
+        <w:t xml:space="preserve">Overall sentiment is healthy (71.8% positive). The risk signal comes from short </w:t>
+      </w:r>
+      <w:r>
+        <w:rPr>
+          <w:b/>
+        </w:rPr>
+        <w:t>bursts</w:t>
+      </w:r>
+      <w:r>
+        <w:t xml:space="preserve"> of negativity rather than persistently negative employees.</w:t>
       </w:r>
     </w:p>
     <w:p>
       <w:pPr>
-        <w:pStyle w:val="ListBullet"/>
+        <w:pStyle w:val="ListNumber"/>
       </w:pPr>
       <w:r>
-        <w:t>Latest month (2011-12) — top positive: eric.bass@enron.com (12), patti.thompson@enron.com (12), lydia.delgado@enron.com (10); top negative: johnny.palmer@enron.com (1), bobette.riner@ipgdirect.com (3), john.arnold@enron.com (4).</w:t>
+        <w:t xml:space="preserve">Prioritise check-ins with </w:t>
+      </w:r>
+      <w:r>
+        <w:rPr>
+          <w:b/>
+        </w:rPr>
+        <w:t>sally.beck@enron.com</w:t>
+      </w:r>
+      <w:r>
+        <w:t xml:space="preserve"> (strongest burst: 5 negatives in 30 days from 2011-08-06) and </w:t>
+      </w:r>
+      <w:r>
+        <w:rPr>
+          <w:b/>
+        </w:rPr>
+        <w:t>don.baughman@enron.com and kayne.coulter@enron.com</w:t>
+      </w:r>
+      <w:r>
+        <w:t xml:space="preserve"> (top-3 negative in 11 of 24 months).</w:t>
       </w:r>
     </w:p>
     <w:p>
       <w:pPr>
-        <w:pStyle w:val="ListBullet"/>
+        <w:pStyle w:val="ListNumber"/>
       </w:pPr>
       <w:r>
-        <w:t>7 of 10 employees are flight risks (≥4 negative messages in a rolling 30-day window): sally.beck@enron.com, bobette.riner@ipgdirect.com, eric.bass@enron.com, john.arnold@enron.com, johnny.palmer@enron.com, kayne.coulter@enron.com, patti.thompson@enron.com.</w:t>
+        <w:t xml:space="preserve">Use the </w:t>
+      </w:r>
+      <w:r>
+        <w:rPr>
+          <w:b/>
+        </w:rPr>
+        <w:t>rolling-window</w:t>
+      </w:r>
+      <w:r>
+        <w:t xml:space="preserve"> flag operationally. It catches 3 employee(s) a monthly report would miss.</w:t>
       </w:r>
     </w:p>
     <w:p>
       <w:pPr>
-        <w:pStyle w:val="ListBullet"/>
+        <w:pStyle w:val="ListNumber"/>
       </w:pPr>
       <w:r>
-        <w:t>Linear regression explains the monthly score well (test R² 0.82, MAE 1.37 vs baseline MAE 3.57); message volume is the dominant driver.</w:t>
+        <w:t>Monthly scores are volume-driven. Report the average score per message alongside the sum, so quiet employees are not mislabelled as disengaged.</w:t>
       </w:r>
     </w:p>
     <w:p>
       <w:pPr>
-        <w:pStyle w:val="ListBullet"/>
+        <w:pStyle w:val="ListNumber"/>
       </w:pPr>
       <w:r>
-        <w:t>Company-wide average monthly score trends slightly upward (+0.045 per month).</w:t>
+        <w:t>Review each flagged window's messages before acting: automated sentiment is a screening tool, not a verdict.</w:t>
       </w:r>
     </w:p>
     <w:p>
@@ -73,7 +109,7 @@
     </w:p>
     <w:p>
       <w:r>
-        <w:t>The project is a reproducible Python pipeline. The main notebook (employee_sentiment_analysis.ipynb) runs every step; reusable logic lives in src/ and is covered by unit tests (tests/). run_pipeline.py regenerates every output from the raw CSV with one command.</w:t>
+        <w:t>The project is a reproducible Python pipeline. The main notebook (employee_sentiment_analysis.ipynb) runs every step; reusable logic lives in src/ and is covered by unit tests (tests/). run_pipeline.py regenerates every output, this report and the README results from the raw CSV with one command.</w:t>
       </w:r>
     </w:p>
     <w:p>
@@ -86,7 +122,7 @@
     </w:p>
     <w:p>
       <w:r>
-        <w:t>E-mail bodies contain quoted-printable artifacts (=20, soft line breaks, control bytes). These are decoded and removed, together with forwarded/quoted history, URLs and e-mail addresses. The text analysed is the subject plus the cleaned body (so the 70 messages with an empty body are labeled from their subject). Dates are parsed to datetime and truncated to calendar months (YYYY-MM).</w:t>
+        <w:t>E-mail bodies contain quoted-printable artifacts (=20, soft line breaks, control bytes). These are decoded and removed, together with forwarded and quoted reply history, URLs and e-mail addresses. The analysed text is the subject plus the cleaned body, so messages with an empty body are labeled from their subject. Dates are parsed to datetime and truncated to calendar months (YYYY-MM).</w:t>
       </w:r>
     </w:p>
     <w:p>
@@ -99,7 +135,129 @@
     </w:p>
     <w:p>
       <w:r>
-        <w:t>src/sentiment.py exposes three interchangeable back-ends: VADER (default), a RoBERTa transformer, and an LLM (Anthropic or OpenAI, zero-shot prompt at temperature 0, cached per message). The reported results use VADER, because it is deterministic and runs offline, so any reviewer can reproduce them without API keys. The rule is: compound ≥ 0.05 → Positive, ≤ -0.05 → Negative, else Neutral. The limitation of a lexicon model is that it reads words, not intent: a few factual messages that contain words such as 'warning' or 'risk' are labeled Negative. Setting SENTIMENT_METHOD=llm in .env switches to the LLM labeler without any other code changes.</w:t>
+        <w:t>src/sentiment.py exposes three interchangeable back-ends: VADER, a RoBERTa transformer, and an LLM. The reported results use VADER (lexicon + rule-based NLP model), which is deterministic and runs offline. Rule: compound ≥ 0.05 → Positive, ≤ -0.05 → Negative, else Neutral. Setting SENTIMENT_METHOD=llm switches to the LLM labeler with no other code changes.</w:t>
+      </w:r>
+    </w:p>
+    <w:p>
+      <w:pPr>
+        <w:pStyle w:val="ListBullet"/>
+      </w:pPr>
+      <w:r>
+        <w:t xml:space="preserve">Labeling method: </w:t>
+      </w:r>
+      <w:r>
+        <w:rPr>
+          <w:b/>
+        </w:rPr>
+        <w:t>VADER (lexicon + rule-based NLP model)</w:t>
+      </w:r>
+      <w:r>
+        <w:t>.</w:t>
+      </w:r>
+    </w:p>
+    <w:p>
+      <w:pPr>
+        <w:pStyle w:val="ListBullet"/>
+      </w:pPr>
+      <w:r>
+        <w:t xml:space="preserve">2,191 messages labeled: </w:t>
+      </w:r>
+      <w:r>
+        <w:rPr>
+          <w:b/>
+        </w:rPr>
+        <w:t>1,573 Positive (71.8%)</w:t>
+      </w:r>
+      <w:r>
+        <w:t xml:space="preserve">, </w:t>
+      </w:r>
+      <w:r>
+        <w:rPr>
+          <w:b/>
+        </w:rPr>
+        <w:t>445 Neutral (20.3%)</w:t>
+      </w:r>
+      <w:r>
+        <w:t xml:space="preserve">, </w:t>
+      </w:r>
+      <w:r>
+        <w:rPr>
+          <w:b/>
+        </w:rPr>
+        <w:t>173 Negative (7.9%)</w:t>
+      </w:r>
+      <w:r>
+        <w:t>.</w:t>
+      </w:r>
+    </w:p>
+    <w:p>
+      <w:pPr>
+        <w:pStyle w:val="ListBullet"/>
+      </w:pPr>
+      <w:r>
+        <w:t xml:space="preserve">The dominant class is </w:t>
+      </w:r>
+      <w:r>
+        <w:rPr>
+          <w:b/>
+        </w:rPr>
+        <w:t>Positive</w:t>
+      </w:r>
+      <w:r>
+        <w:t>. The corpus is mostly routine business correspondence, so polite and informational messages far outnumber complaints.</w:t>
+      </w:r>
+    </w:p>
+    <w:p>
+      <w:pPr>
+        <w:pStyle w:val="ListBullet"/>
+      </w:pPr>
+      <w:r>
+        <w:t xml:space="preserve">Known limitation of a lexicon model: it reads words, not intent. Some purely factual messages that contain words such as </w:t>
+      </w:r>
+      <w:r>
+        <w:rPr>
+          <w:i/>
+        </w:rPr>
+        <w:t>risk</w:t>
+      </w:r>
+      <w:r>
+        <w:t xml:space="preserve">, </w:t>
+      </w:r>
+      <w:r>
+        <w:rPr>
+          <w:i/>
+        </w:rPr>
+        <w:t>problem</w:t>
+      </w:r>
+      <w:r>
+        <w:t xml:space="preserve"> or </w:t>
+      </w:r>
+      <w:r>
+        <w:rPr>
+          <w:i/>
+        </w:rPr>
+        <w:t>warning</w:t>
+      </w:r>
+      <w:r>
+        <w:t xml:space="preserve"> (e.g. automatic mailbox warnings) are labeled Negative. Setting </w:t>
+      </w:r>
+      <w:r>
+        <w:rPr>
+          <w:rFonts w:ascii="Consolas" w:hAnsi="Consolas"/>
+          <w:sz w:val="20"/>
+        </w:rPr>
+        <w:t>SENTIMENT_METHOD=llm</w:t>
+      </w:r>
+      <w:r>
+        <w:t xml:space="preserve"> switches to an LLM labeler with no other code changes.</w:t>
+      </w:r>
+    </w:p>
+    <w:p>
+      <w:pPr>
+        <w:pStyle w:val="ListBullet"/>
+      </w:pPr>
+      <w:r>
+        <w:t>70 messages have an empty body. They are labeled from their subject line, which is why the subject is part of the analysed text.</w:t>
       </w:r>
     </w:p>
     <w:p>
@@ -115,7 +273,72 @@
         <w:pStyle w:val="ListBullet"/>
       </w:pPr>
       <w:r>
-        <w:t>2,191 rows × 4 text columns (Subject, body, date, from); no missing values; 0 fully duplicated rows.</w:t>
+        <w:rPr>
+          <w:b/>
+        </w:rPr>
+        <w:t>Structure:</w:t>
+      </w:r>
+      <w:r>
+        <w:t xml:space="preserve"> 2,191 rows × 4 columns (</w:t>
+      </w:r>
+      <w:r>
+        <w:rPr>
+          <w:rFonts w:ascii="Consolas" w:hAnsi="Consolas"/>
+          <w:sz w:val="20"/>
+        </w:rPr>
+        <w:t>Subject</w:t>
+      </w:r>
+      <w:r>
+        <w:t xml:space="preserve">, </w:t>
+      </w:r>
+      <w:r>
+        <w:rPr>
+          <w:rFonts w:ascii="Consolas" w:hAnsi="Consolas"/>
+          <w:sz w:val="20"/>
+        </w:rPr>
+        <w:t>body</w:t>
+      </w:r>
+      <w:r>
+        <w:t xml:space="preserve">, </w:t>
+      </w:r>
+      <w:r>
+        <w:rPr>
+          <w:rFonts w:ascii="Consolas" w:hAnsi="Consolas"/>
+          <w:sz w:val="20"/>
+        </w:rPr>
+        <w:t>date</w:t>
+      </w:r>
+      <w:r>
+        <w:t xml:space="preserve">, </w:t>
+      </w:r>
+      <w:r>
+        <w:rPr>
+          <w:rFonts w:ascii="Consolas" w:hAnsi="Consolas"/>
+          <w:sz w:val="20"/>
+        </w:rPr>
+        <w:t>from</w:t>
+      </w:r>
+      <w:r>
+        <w:t xml:space="preserve">); </w:t>
+      </w:r>
+      <w:r>
+        <w:rPr>
+          <w:b/>
+        </w:rPr>
+        <w:t>no missing values</w:t>
+      </w:r>
+      <w:r>
+        <w:t xml:space="preserve">; 0 fully duplicated rows. </w:t>
+      </w:r>
+      <w:r>
+        <w:rPr>
+          <w:rFonts w:ascii="Consolas" w:hAnsi="Consolas"/>
+          <w:sz w:val="20"/>
+        </w:rPr>
+        <w:t>date</w:t>
+      </w:r>
+      <w:r>
+        <w:t xml:space="preserve"> is parsed to datetime.</w:t>
       </w:r>
     </w:p>
     <w:p>
@@ -123,7 +346,13 @@
         <w:pStyle w:val="ListBullet"/>
       </w:pPr>
       <w:r>
-        <w:t>10 employees, each active in all 24 months (240 employee-months).</w:t>
+        <w:rPr>
+          <w:b/>
+        </w:rPr>
+        <w:t>Coverage:</w:t>
+      </w:r>
+      <w:r>
+        <w:t xml:space="preserve"> 10 employees, 24 months (2010-01-01 to 2011-12-31), and every employee is active in every month.</w:t>
       </w:r>
     </w:p>
     <w:p>
@@ -131,7 +360,22 @@
         <w:pStyle w:val="ListBullet"/>
       </w:pPr>
       <w:r>
-        <w:t>Anomaly: monthly volume is almost constant (91–92 messages) and weekends are as busy as weekdays, which suggests the dates were assigned synthetically. Time-based conclusions should be read with caution.</w:t>
+        <w:rPr>
+          <w:b/>
+        </w:rPr>
+        <w:t>Anomaly:</w:t>
+      </w:r>
+      <w:r>
+        <w:t xml:space="preserve"> Monthly volume is almost perfectly flat (91–92 messages per month); 30.5% of messages fall on weekends, about the same rate as weekdays. Real e-mail traffic is rarely this uniform, so the dates appear to have been </w:t>
+      </w:r>
+      <w:r>
+        <w:rPr>
+          <w:b/>
+        </w:rPr>
+        <w:t>assigned synthetically</w:t>
+      </w:r>
+      <w:r>
+        <w:t>. Time-based conclusions should be read with caution.</w:t>
       </w:r>
     </w:p>
     <w:p>
@@ -139,7 +383,13 @@
         <w:pStyle w:val="ListBullet"/>
       </w:pPr>
       <w:r>
-        <w:t>Anomaly: 625 messages repeat an earlier subject + body on a different date. They are kept, because each row is a sent message.</w:t>
+        <w:rPr>
+          <w:b/>
+        </w:rPr>
+        <w:t>Anomaly:</w:t>
+      </w:r>
+      <w:r>
+        <w:t xml:space="preserve"> 625 messages repeat an earlier subject + body on a different date. They are kept because each row is a distinct sent message, but they inflate some employees' counts.</w:t>
       </w:r>
     </w:p>
     <w:p>
@@ -147,7 +397,13 @@
         <w:pStyle w:val="ListBullet"/>
       </w:pPr>
       <w:r>
-        <w:t>Positive messages are the longest (median 35 words) and Neutral the shortest (median 9 words).</w:t>
+        <w:rPr>
+          <w:b/>
+        </w:rPr>
+        <w:t>Trend:</w:t>
+      </w:r>
+      <w:r>
+        <w:t xml:space="preserve"> the mean message score moves from 0.62 (2010) to 0.66 (2011).</w:t>
       </w:r>
     </w:p>
     <w:p>
@@ -155,7 +411,27 @@
         <w:pStyle w:val="ListBullet"/>
       </w:pPr>
       <w:r>
-        <w:t>The positive share is stable over time; the mean message score rises from 0.62 (2010) to 0.66 (2011).</w:t>
+        <w:rPr>
+          <w:b/>
+        </w:rPr>
+        <w:t>Employees:</w:t>
+      </w:r>
+      <w:r>
+        <w:t xml:space="preserve"> activity ranges from 172 (rhonda.denton@enron.com) to 284 messages (lydia.delgado@enron.com). Highest negative share: sally.beck@enron.com (11.0%), bobette.riner@ipgdirect.com (10.6%), kayne.coulter@enron.com (10.3%). Lowest: john.arnold@enron.com (4.7%).</w:t>
+      </w:r>
+    </w:p>
+    <w:p>
+      <w:pPr>
+        <w:pStyle w:val="ListBullet"/>
+      </w:pPr>
+      <w:r>
+        <w:rPr>
+          <w:b/>
+        </w:rPr>
+        <w:t>Length:</w:t>
+      </w:r>
+      <w:r>
+        <w:t xml:space="preserve"> Positive messages are the longest (median 35 words) and Neutral the shortest (median 9 words).</w:t>
       </w:r>
     </w:p>
     <w:p>
@@ -303,7 +579,46 @@
     </w:p>
     <w:p>
       <w:r>
-        <w:t>Each message scores Positive +1, Negative −1, Neutral 0. Scores are summed per employee per calendar month; each month is an independent group, so the score resets to 0 at the start of every month. Validation checks confirm that the monthly totals equal the per-message total and that score = positives − negatives. Monthly scores range from -1 to 20 (mean 5.8).</w:t>
+        <w:t>Each message scores Positive +1, Negative −1, Neutral 0. Scores are summed per employee per calendar month. Each month is an independent group, so the score resets to 0 at the start of every month.</w:t>
+      </w:r>
+    </w:p>
+    <w:p>
+      <w:pPr>
+        <w:pStyle w:val="ListBullet"/>
+      </w:pPr>
+      <w:r>
+        <w:t xml:space="preserve">Monthly scores range from </w:t>
+      </w:r>
+      <w:r>
+        <w:rPr>
+          <w:b/>
+        </w:rPr>
+        <w:t>-1 to 20</w:t>
+      </w:r>
+      <w:r>
+        <w:t xml:space="preserve"> (mean 5.8, median 5.5).</w:t>
+      </w:r>
+    </w:p>
+    <w:p>
+      <w:pPr>
+        <w:pStyle w:val="ListBullet"/>
+      </w:pPr>
+      <w:r>
+        <w:rPr>
+          <w:b/>
+        </w:rPr>
+        <w:t>11 of 240 employee-months are ≤ 0.</w:t>
+      </w:r>
+      <w:r>
+        <w:t xml:space="preserve"> The most frequent is kayne.coulter@enron.com with 3 (2010-02, 2010-10, 2011-06).</w:t>
+      </w:r>
+    </w:p>
+    <w:p>
+      <w:pPr>
+        <w:pStyle w:val="ListBullet"/>
+      </w:pPr>
+      <w:r>
+        <w:t>The validation asserts confirm that no message was lost or double-counted in the aggregation, and that score = positives − negatives in every month.</w:t>
       </w:r>
     </w:p>
     <w:p>
@@ -1148,6 +1463,42 @@
     </w:tbl>
     <w:p/>
     <w:p>
+      <w:pPr>
+        <w:pStyle w:val="ListBullet"/>
+      </w:pPr>
+      <w:r>
+        <w:rPr>
+          <w:b/>
+        </w:rPr>
+        <w:t>Latest month (2011-12):</w:t>
+      </w:r>
+      <w:r>
+        <w:t xml:space="preserve"> top positive: eric.bass@enron.com (12), patti.thompson@enron.com (12), lydia.delgado@enron.com (10). Top negative: johnny.palmer@enron.com (1), bobette.riner@ipgdirect.com (3), john.arnold@enron.com (4). Ties are broken alphabetically.</w:t>
+      </w:r>
+    </w:p>
+    <w:p>
+      <w:pPr>
+        <w:pStyle w:val="ListBullet"/>
+      </w:pPr>
+      <w:r>
+        <w:rPr>
+          <w:b/>
+        </w:rPr>
+        <w:t>Consistency across 24 months:</w:t>
+      </w:r>
+      <w:r>
+        <w:t xml:space="preserve"> john.arnold@enron.com is in the monthly top-3 positive most often (13 months). don.baughman@enron.com and kayne.coulter@enron.com appear in the top-3 negative most often (11 months).</w:t>
+      </w:r>
+    </w:p>
+    <w:p>
+      <w:pPr>
+        <w:pStyle w:val="ListBullet"/>
+      </w:pPr>
+      <w:r>
+        <w:t>Rankings partly reflect volume: the score is a sum, so prolific writers rank higher. The whole-period leader is lydia.delgado@enron.com (+187).</w:t>
+      </w:r>
+    </w:p>
+    <w:p>
       <w:r>
         <w:drawing>
           <wp:inline xmlns:a="http://schemas.openxmlformats.org/drawingml/2006/main" xmlns:pic="http://schemas.openxmlformats.org/drawingml/2006/picture">
@@ -1247,7 +1598,7 @@
     </w:p>
     <w:p>
       <w:r>
-        <w:t>Criterion: 4 or more Negative messages within any rolling 30-day period, irrespective of calendar month or score. For each employee, the negative-message dates are sorted and a window is slid over them. The employee is flagged if four consecutive negatives fall within days d to d+29. Unit tests cover month-straddling windows and the exact 30-day boundary.</w:t>
+        <w:t>Criterion: 4 or more Negative messages within any rolling 30-day period, irrespective of calendar month or score. For each employee, the negative-message dates are sorted and a window is slid over them. The employee is flagged if four negatives fall within days d to d+29. Unit tests cover month-straddling windows and the exact 30-day boundary.</w:t>
       </w:r>
     </w:p>
     <w:p>
@@ -1862,8 +2213,61 @@
     </w:tbl>
     <w:p/>
     <w:p>
+      <w:pPr>
+        <w:pStyle w:val="ListBullet"/>
+      </w:pPr>
       <w:r>
-        <w:t>A naive calendar-month count would flag only 4 employees. The rolling window additionally catches bobette.riner@ipgdirect.com, john.arnold@enron.com, johnny.palmer@enron.com, whose bursts of negativity straddle a month boundary. Every qualifying window is listed in data/processed/flight_risk_windows.csv (10 windows) so that flags can be reviewed manually.</w:t>
+        <w:rPr>
+          <w:b/>
+        </w:rPr>
+        <w:t>7 of 10 employees are flagged</w:t>
+      </w:r>
+      <w:r>
+        <w:t xml:space="preserve"> (max negatives in one 30-day window): sally.beck@enron.com (5), bobette.riner@ipgdirect.com (4), eric.bass@enron.com (4), john.arnold@enron.com (4), johnny.palmer@enron.com (4), kayne.coulter@enron.com (4), patti.thompson@enron.com (4).</w:t>
+      </w:r>
+    </w:p>
+    <w:p>
+      <w:pPr>
+        <w:pStyle w:val="ListBullet"/>
+      </w:pPr>
+      <w:r>
+        <w:t xml:space="preserve">A calendar-month count would flag only </w:t>
+      </w:r>
+      <w:r>
+        <w:rPr>
+          <w:b/>
+        </w:rPr>
+        <w:t>4</w:t>
+      </w:r>
+      <w:r>
+        <w:t xml:space="preserve">. The rolling window adds </w:t>
+      </w:r>
+      <w:r>
+        <w:rPr>
+          <w:b/>
+        </w:rPr>
+        <w:t>bobette.riner@ipgdirect.com, john.arnold@enron.com and johnny.palmer@enron.com</w:t>
+      </w:r>
+      <w:r>
+        <w:t>, whose negative bursts straddle a month boundary. This is why the brief specifies a rolling window.</w:t>
+      </w:r>
+    </w:p>
+    <w:p>
+      <w:pPr>
+        <w:pStyle w:val="ListBullet"/>
+      </w:pPr>
+      <w:r>
+        <w:t xml:space="preserve">The flag is deliberately independent of the score: an employee with a high long-run score can still have a short burst of negativity. Every qualifying window is listed in </w:t>
+      </w:r>
+      <w:r>
+        <w:rPr>
+          <w:rFonts w:ascii="Consolas" w:hAnsi="Consolas"/>
+          <w:sz w:val="20"/>
+        </w:rPr>
+        <w:t>data/processed/flight_risk_windows.csv</w:t>
+      </w:r>
+      <w:r>
+        <w:t xml:space="preserve"> so that each flag can be reviewed manually.</w:t>
       </w:r>
     </w:p>
     <w:p>
@@ -1921,7 +2325,7 @@
     </w:p>
     <w:p>
       <w:r>
-        <w:t>Target: the monthly score per employee (240 employee-months). Features are behavioural and not derived from the sentiment labels (to avoid leakage): message count, average length in characters and words, total words, active days, average exclamation and question marks per message, the previous month's score, and a time index. Model: StandardScaler + LinearRegression (scikit-learn), 80/20 split (random_state=42), 5-fold cross-validation, compared with a mean-only baseline.</w:t>
+        <w:t>Target: the monthly score per employee-month. Features are behavioural and not derived from the sentiment labels (to avoid leakage): message count, average length in characters and words, total words, active days, average exclamation and question marks per message, the previous month's score, and a time index. Model: StandardScaler + LinearRegression (scikit-learn), 80/20 split (random_state=42), 5-fold cross-validation, compared with a mean-only baseline.</w:t>
       </w:r>
     </w:p>
     <w:p>
@@ -2521,7 +2925,40 @@
         <w:pStyle w:val="ListBullet"/>
       </w:pPr>
       <w:r>
-        <w:t>The model generalises well: train and test R² are almost equal, and cross-validation is stable.</w:t>
+        <w:rPr>
+          <w:b/>
+        </w:rPr>
+        <w:t>Performance:</w:t>
+      </w:r>
+      <w:r>
+        <w:t xml:space="preserve"> test R² = </w:t>
+      </w:r>
+      <w:r>
+        <w:rPr>
+          <w:b/>
+        </w:rPr>
+        <w:t>0.82</w:t>
+      </w:r>
+      <w:r>
+        <w:t xml:space="preserve">, MAE = </w:t>
+      </w:r>
+      <w:r>
+        <w:rPr>
+          <w:b/>
+        </w:rPr>
+        <w:t>1.37</w:t>
+      </w:r>
+      <w:r>
+        <w:t xml:space="preserve">, RMSE = </w:t>
+      </w:r>
+      <w:r>
+        <w:rPr>
+          <w:b/>
+        </w:rPr>
+        <w:t>1.79</w:t>
+      </w:r>
+      <w:r>
+        <w:t>, against a mean-only baseline with MAE 3.57 / RMSE 4.25. 5-fold cross-validation R² = 0.80 ± 0.03. Train R² ≈ test R², so there is no sign of overfitting.</w:t>
       </w:r>
     </w:p>
     <w:p>
@@ -2529,7 +2966,26 @@
         <w:pStyle w:val="ListBullet"/>
       </w:pPr>
       <w:r>
-        <w:t>Message count dominates. Because about 72% of messages are positive, each extra message adds about +0.64 on average, so the score largely measures how much an employee communicates.</w:t>
+        <w:rPr>
+          <w:b/>
+        </w:rPr>
+        <w:t>Strongest driver:</w:t>
+      </w:r>
+      <w:r>
+        <w:t xml:space="preserve"> </w:t>
+      </w:r>
+      <w:r>
+        <w:rPr>
+          <w:rFonts w:ascii="Consolas" w:hAnsi="Consolas"/>
+          <w:sz w:val="20"/>
+        </w:rPr>
+        <w:t>message_count</w:t>
+      </w:r>
+      <w:r>
+        <w:t xml:space="preserve"> (standardised coefficient +4.12).</w:t>
+      </w:r>
+      <w:r>
+        <w:t xml:space="preserve"> The average message scores +0.64, so every extra message moves the monthly score by about that much. The monthly score is largely a function of how much an employee communicates.</w:t>
       </w:r>
     </w:p>
     <w:p>
@@ -2537,7 +2993,14 @@
         <w:pStyle w:val="ListBullet"/>
       </w:pPr>
       <w:r>
-        <w:t>More exclamation and question marks per message slightly raise the score. The previous month's score is slightly negative (mild mean reversion), and the time index is slightly positive (upward trend).</w:t>
+        <w:rPr>
+          <w:rFonts w:ascii="Consolas" w:hAnsi="Consolas"/>
+          <w:sz w:val="20"/>
+        </w:rPr>
+        <w:t>prev_month_score</w:t>
+      </w:r>
+      <w:r>
+        <w:t xml:space="preserve"> is slightly negative (mild mean reversion); the company-wide average score trends +0.045 points per month.</w:t>
       </w:r>
     </w:p>
     <w:p>
@@ -2545,7 +3008,22 @@
         <w:pStyle w:val="ListBullet"/>
       </w:pPr>
       <w:r>
-        <w:t>Next step: model a volume-normalised target (average score per message) to isolate tone from activity.</w:t>
+        <w:rPr>
+          <w:b/>
+        </w:rPr>
+        <w:t>Significance:</w:t>
+      </w:r>
+      <w:r>
+        <w:t xml:space="preserve"> the model describes and forecasts the </w:t>
+      </w:r>
+      <w:r>
+        <w:rPr>
+          <w:i/>
+        </w:rPr>
+        <w:t>level</w:t>
+      </w:r>
+      <w:r>
+        <w:t xml:space="preserve"> of the score well. Because volume drives much of it, a volume-normalised target (average score per message) would better isolate tone, and is the natural next iteration.</w:t>
       </w:r>
     </w:p>
     <w:p>
@@ -2693,42 +3171,78 @@
     </w:p>
     <w:p>
       <w:pPr>
-        <w:pStyle w:val="ListBullet"/>
+        <w:pStyle w:val="ListNumber"/>
       </w:pPr>
       <w:r>
-        <w:t>Overall sentiment is healthy and stable. Risk shows up as short bursts of negativity rather than persistently negative employees.</w:t>
+        <w:t xml:space="preserve">Overall sentiment is healthy (71.8% positive). The risk signal comes from short </w:t>
+      </w:r>
+      <w:r>
+        <w:rPr>
+          <w:b/>
+        </w:rPr>
+        <w:t>bursts</w:t>
+      </w:r>
+      <w:r>
+        <w:t xml:space="preserve"> of negativity rather than persistently negative employees.</w:t>
       </w:r>
     </w:p>
     <w:p>
       <w:pPr>
-        <w:pStyle w:val="ListBullet"/>
+        <w:pStyle w:val="ListNumber"/>
       </w:pPr>
       <w:r>
-        <w:t>Prioritise check-ins with sally.beck (strongest burst: 5 negatives in 30 days; highest negative share) and kayne.coulter (top-3 negative in 11 of 24 months).</w:t>
+        <w:t xml:space="preserve">Prioritise check-ins with </w:t>
+      </w:r>
+      <w:r>
+        <w:rPr>
+          <w:b/>
+        </w:rPr>
+        <w:t>sally.beck@enron.com</w:t>
+      </w:r>
+      <w:r>
+        <w:t xml:space="preserve"> (strongest burst: 5 negatives in 30 days from 2011-08-06) and </w:t>
+      </w:r>
+      <w:r>
+        <w:rPr>
+          <w:b/>
+        </w:rPr>
+        <w:t>don.baughman@enron.com and kayne.coulter@enron.com</w:t>
+      </w:r>
+      <w:r>
+        <w:t xml:space="preserve"> (top-3 negative in 11 of 24 months).</w:t>
       </w:r>
     </w:p>
     <w:p>
       <w:pPr>
-        <w:pStyle w:val="ListBullet"/>
+        <w:pStyle w:val="ListNumber"/>
       </w:pPr>
       <w:r>
-        <w:t>Use the rolling-window flag operationally, since it catches employees a monthly report misses.</w:t>
+        <w:t xml:space="preserve">Use the </w:t>
+      </w:r>
+      <w:r>
+        <w:rPr>
+          <w:b/>
+        </w:rPr>
+        <w:t>rolling-window</w:t>
+      </w:r>
+      <w:r>
+        <w:t xml:space="preserve"> flag operationally. It catches 3 employee(s) a monthly report would miss.</w:t>
       </w:r>
     </w:p>
     <w:p>
       <w:pPr>
-        <w:pStyle w:val="ListBullet"/>
+        <w:pStyle w:val="ListNumber"/>
       </w:pPr>
       <w:r>
-        <w:t>Report average score per message alongside the monthly sum, so low-volume employees are not mistaken for disengaged ones.</w:t>
+        <w:t>Monthly scores are volume-driven. Report the average score per message alongside the sum, so quiet employees are not mislabelled as disengaged.</w:t>
       </w:r>
     </w:p>
     <w:p>
       <w:pPr>
-        <w:pStyle w:val="ListBullet"/>
+        <w:pStyle w:val="ListNumber"/>
       </w:pPr>
       <w:r>
-        <w:t>For production, use the LLM labeler to reduce false negatives on factual messages, and review flagged windows before acting.</w:t>
+        <w:t>Review each flagged window's messages before acting: automated sentiment is a screening tool, not a verdict.</w:t>
       </w:r>
     </w:p>
     <w:sectPr>

</xml_diff>

<commit_message>
Switch default sentiment labeling to a transformer model
VADER (lexicon/rule-based) was the default backend, so every reported
result was heuristic rather than model-based. Make the Hugging Face
RoBERTa sentiment model (cardiffnlp/twitter-roberta-base-sentiment-latest)
the default, required backend instead, with VADER kept as an optional
lighter-weight fallback. Regenerated all outputs, charts, the notebook,
the README results section and the Final Report from the transformer
labels.
</commit_message>
<xml_diff>
--- a/reports/Final_Report.docx
+++ b/reports/Final_Report.docx
@@ -12,7 +12,7 @@
     </w:p>
     <w:p>
       <w:r>
-        <w:t>Dataset: test.csv — 2,191 employee e-mails from 10 employees, 2010-01-01 to 2011-12-31 (24 months). Sentiment labeling: VADER (lexicon + rule-based NLP model). All numbers and findings in this report are generated from the pipeline outputs (src/report.py).</w:t>
+        <w:t>Dataset: test.csv — 2,191 employee e-mails from 10 employees, 2010-01-01 to 2011-12-31 (24 months). Sentiment labeling: a RoBERTa transformer (cardiffnlp/twitter-roberta-base-sentiment-latest). All numbers and findings in this report are generated from the pipeline outputs (src/report.py).</w:t>
       </w:r>
     </w:p>
     <w:p>
@@ -28,7 +28,7 @@
         <w:pStyle w:val="ListNumber"/>
       </w:pPr>
       <w:r>
-        <w:t xml:space="preserve">Overall sentiment is healthy (71.8% positive). The risk signal comes from short </w:t>
+        <w:t xml:space="preserve">Overall sentiment is mixed (23.7% positive). The risk signal comes from short </w:t>
       </w:r>
       <w:r>
         <w:rPr>
@@ -51,19 +51,19 @@
         <w:rPr>
           <w:b/>
         </w:rPr>
-        <w:t>sally.beck@enron.com</w:t>
+        <w:t>john.arnold@enron.com</w:t>
       </w:r>
       <w:r>
-        <w:t xml:space="preserve"> (strongest burst: 5 negatives in 30 days from 2011-08-06) and </w:t>
+        <w:t xml:space="preserve"> (strongest burst: 4 negatives in 30 days from 2010-06-06) and </w:t>
       </w:r>
       <w:r>
         <w:rPr>
           <w:b/>
         </w:rPr>
-        <w:t>don.baughman@enron.com and kayne.coulter@enron.com</w:t>
+        <w:t>don.baughman@enron.com</w:t>
       </w:r>
       <w:r>
-        <w:t xml:space="preserve"> (top-3 negative in 11 of 24 months).</w:t>
+        <w:t xml:space="preserve"> (top-3 negative in 12 of 24 months).</w:t>
       </w:r>
     </w:p>
     <w:p>
@@ -80,7 +80,7 @@
         <w:t>rolling-window</w:t>
       </w:r>
       <w:r>
-        <w:t xml:space="preserve"> flag operationally. It catches 3 employee(s) a monthly report would miss.</w:t>
+        <w:t xml:space="preserve"> flag operationally. It catches 2 employee(s) a monthly report would miss.</w:t>
       </w:r>
     </w:p>
     <w:p>
@@ -135,7 +135,7 @@
     </w:p>
     <w:p>
       <w:r>
-        <w:t>src/sentiment.py exposes three interchangeable back-ends: VADER, a RoBERTa transformer, and an LLM. The reported results use VADER (lexicon + rule-based NLP model), which is deterministic and runs offline. Rule: compound ≥ 0.05 → Positive, ≤ -0.05 → Negative, else Neutral. Setting SENTIMENT_METHOD=llm switches to the LLM labeler with no other code changes.</w:t>
+        <w:t>src/sentiment.py exposes three interchangeable back-ends: VADER, a RoBERTa transformer, and an LLM. The reported results use a RoBERTa transformer (cardiffnlp/twitter-roberta-base-sentiment-latest), which is deterministic and runs offline. Rule: compound ≥ 0.05 → Positive, ≤ -0.05 → Negative, else Neutral. Setting SENTIMENT_METHOD=llm switches to the LLM labeler with no other code changes.</w:t>
       </w:r>
     </w:p>
     <w:p>
@@ -149,7 +149,7 @@
         <w:rPr>
           <w:b/>
         </w:rPr>
-        <w:t>VADER (lexicon + rule-based NLP model)</w:t>
+        <w:t>a RoBERTa transformer (cardiffnlp/twitter-roberta-base-sentiment-latest)</w:t>
       </w:r>
       <w:r>
         <w:t>.</w:t>
@@ -166,7 +166,7 @@
         <w:rPr>
           <w:b/>
         </w:rPr>
-        <w:t>1,573 Positive (71.8%)</w:t>
+        <w:t>520 Positive (23.7%)</w:t>
       </w:r>
       <w:r>
         <w:t xml:space="preserve">, </w:t>
@@ -175,7 +175,7 @@
         <w:rPr>
           <w:b/>
         </w:rPr>
-        <w:t>445 Neutral (20.3%)</w:t>
+        <w:t>1,524 Neutral (69.6%)</w:t>
       </w:r>
       <w:r>
         <w:t xml:space="preserve">, </w:t>
@@ -184,7 +184,7 @@
         <w:rPr>
           <w:b/>
         </w:rPr>
-        <w:t>173 Negative (7.9%)</w:t>
+        <w:t>147 Negative (6.7%)</w:t>
       </w:r>
       <w:r>
         <w:t>.</w:t>
@@ -201,55 +201,10 @@
         <w:rPr>
           <w:b/>
         </w:rPr>
-        <w:t>Positive</w:t>
+        <w:t>Neutral</w:t>
       </w:r>
       <w:r>
         <w:t>. The corpus is mostly routine business correspondence, so polite and informational messages far outnumber complaints.</w:t>
-      </w:r>
-    </w:p>
-    <w:p>
-      <w:pPr>
-        <w:pStyle w:val="ListBullet"/>
-      </w:pPr>
-      <w:r>
-        <w:t xml:space="preserve">Known limitation of a lexicon model: it reads words, not intent. Some purely factual messages that contain words such as </w:t>
-      </w:r>
-      <w:r>
-        <w:rPr>
-          <w:i/>
-        </w:rPr>
-        <w:t>risk</w:t>
-      </w:r>
-      <w:r>
-        <w:t xml:space="preserve">, </w:t>
-      </w:r>
-      <w:r>
-        <w:rPr>
-          <w:i/>
-        </w:rPr>
-        <w:t>problem</w:t>
-      </w:r>
-      <w:r>
-        <w:t xml:space="preserve"> or </w:t>
-      </w:r>
-      <w:r>
-        <w:rPr>
-          <w:i/>
-        </w:rPr>
-        <w:t>warning</w:t>
-      </w:r>
-      <w:r>
-        <w:t xml:space="preserve"> (e.g. automatic mailbox warnings) are labeled Negative. Setting </w:t>
-      </w:r>
-      <w:r>
-        <w:rPr>
-          <w:rFonts w:ascii="Consolas" w:hAnsi="Consolas"/>
-          <w:sz w:val="20"/>
-        </w:rPr>
-        <w:t>SENTIMENT_METHOD=llm</w:t>
-      </w:r>
-      <w:r>
-        <w:t xml:space="preserve"> switches to an LLM labeler with no other code changes.</w:t>
       </w:r>
     </w:p>
     <w:p>
@@ -403,7 +358,7 @@
         <w:t>Trend:</w:t>
       </w:r>
       <w:r>
-        <w:t xml:space="preserve"> the mean message score moves from 0.62 (2010) to 0.66 (2011).</w:t>
+        <w:t xml:space="preserve"> the mean message score moves from 0.15 (2010) to 0.19 (2011).</w:t>
       </w:r>
     </w:p>
     <w:p>
@@ -417,7 +372,7 @@
         <w:t>Employees:</w:t>
       </w:r>
       <w:r>
-        <w:t xml:space="preserve"> activity ranges from 172 (rhonda.denton@enron.com) to 284 messages (lydia.delgado@enron.com). Highest negative share: sally.beck@enron.com (11.0%), bobette.riner@ipgdirect.com (10.6%), kayne.coulter@enron.com (10.3%). Lowest: john.arnold@enron.com (4.7%).</w:t>
+        <w:t xml:space="preserve"> activity ranges from 172 (rhonda.denton@enron.com) to 284 messages (lydia.delgado@enron.com). Highest negative share: bobette.riner@ipgdirect.com (9.2%), john.arnold@enron.com (9.0%), patti.thompson@enron.com (7.6%). Lowest: eric.bass@enron.com (3.8%).</w:t>
       </w:r>
     </w:p>
     <w:p>
@@ -431,14 +386,14 @@
         <w:t>Length:</w:t>
       </w:r>
       <w:r>
-        <w:t xml:space="preserve"> Positive messages are the longest (median 35 words) and Neutral the shortest (median 9 words).</w:t>
+        <w:t xml:space="preserve"> Positive messages are the longest (median 32 words) and Negative the shortest (median 19 words).</w:t>
       </w:r>
     </w:p>
     <w:p>
       <w:r>
         <w:drawing>
           <wp:inline xmlns:a="http://schemas.openxmlformats.org/drawingml/2006/main" xmlns:pic="http://schemas.openxmlformats.org/drawingml/2006/picture">
-            <wp:extent cx="4389120" cy="2661488"/>
+            <wp:extent cx="4389120" cy="2622254"/>
             <wp:docPr id="1" name="Picture 1"/>
             <wp:cNvGraphicFramePr>
               <a:graphicFrameLocks noChangeAspect="1"/>
@@ -459,7 +414,7 @@
                   <pic:spPr>
                     <a:xfrm>
                       <a:off x="0" y="0"/>
-                      <a:ext cx="4389120" cy="2661488"/>
+                      <a:ext cx="4389120" cy="2622254"/>
                     </a:xfrm>
                     <a:prstGeom prst="rect"/>
                   </pic:spPr>
@@ -483,7 +438,7 @@
       <w:r>
         <w:drawing>
           <wp:inline xmlns:a="http://schemas.openxmlformats.org/drawingml/2006/main" xmlns:pic="http://schemas.openxmlformats.org/drawingml/2006/picture">
-            <wp:extent cx="5760720" cy="2859961"/>
+            <wp:extent cx="5760720" cy="2845657"/>
             <wp:docPr id="2" name="Picture 2"/>
             <wp:cNvGraphicFramePr>
               <a:graphicFrameLocks noChangeAspect="1"/>
@@ -504,7 +459,7 @@
                   <pic:spPr>
                     <a:xfrm>
                       <a:off x="0" y="0"/>
-                      <a:ext cx="5760720" cy="2859961"/>
+                      <a:ext cx="5760720" cy="2845657"/>
                     </a:xfrm>
                     <a:prstGeom prst="rect"/>
                   </pic:spPr>
@@ -528,7 +483,7 @@
       <w:r>
         <w:drawing>
           <wp:inline xmlns:a="http://schemas.openxmlformats.org/drawingml/2006/main" xmlns:pic="http://schemas.openxmlformats.org/drawingml/2006/picture">
-            <wp:extent cx="5029200" cy="2930342"/>
+            <wp:extent cx="5029200" cy="2835690"/>
             <wp:docPr id="3" name="Picture 3"/>
             <wp:cNvGraphicFramePr>
               <a:graphicFrameLocks noChangeAspect="1"/>
@@ -549,7 +504,7 @@
                   <pic:spPr>
                     <a:xfrm>
                       <a:off x="0" y="0"/>
-                      <a:ext cx="5029200" cy="2930342"/>
+                      <a:ext cx="5029200" cy="2835690"/>
                     </a:xfrm>
                     <a:prstGeom prst="rect"/>
                   </pic:spPr>
@@ -593,10 +548,10 @@
         <w:rPr>
           <w:b/>
         </w:rPr>
-        <w:t>-1 to 20</w:t>
+        <w:t>-3 to 8</w:t>
       </w:r>
       <w:r>
-        <w:t xml:space="preserve"> (mean 5.8, median 5.5).</w:t>
+        <w:t xml:space="preserve"> (mean 1.6, median 1.0).</w:t>
       </w:r>
     </w:p>
     <w:p>
@@ -607,10 +562,10 @@
         <w:rPr>
           <w:b/>
         </w:rPr>
-        <w:t>11 of 240 employee-months are ≤ 0.</w:t>
+        <w:t>78 of 240 employee-months are ≤ 0.</w:t>
       </w:r>
       <w:r>
-        <w:t xml:space="preserve"> The most frequent is kayne.coulter@enron.com with 3 (2010-02, 2010-10, 2011-06).</w:t>
+        <w:t xml:space="preserve"> The most frequent is john.arnold@enron.com with 11 (2010-01, 2010-02, 2010-06, 2010-07, 2010-09, 2010-10, 2011-01, 2011-04, 2011-05, 2011-07, 2011-09).</w:t>
       </w:r>
     </w:p>
     <w:p>
@@ -756,6 +711,78 @@
               <w:rPr>
                 <w:sz w:val="19"/>
               </w:rPr>
+              <w:t>kayne.coulter@enron.com</w:t>
+            </w:r>
+          </w:p>
+        </w:tc>
+        <w:tc>
+          <w:tcPr>
+            <w:tcW w:type="dxa" w:w="1008"/>
+          </w:tcPr>
+          <w:p>
+            <w:r/>
+            <w:r>
+              <w:rPr>
+                <w:sz w:val="19"/>
+              </w:rPr>
+              <w:t>4</w:t>
+            </w:r>
+          </w:p>
+        </w:tc>
+        <w:tc>
+          <w:tcPr>
+            <w:tcW w:type="dxa" w:w="3024"/>
+          </w:tcPr>
+          <w:p>
+            <w:r/>
+            <w:r>
+              <w:rPr>
+                <w:sz w:val="19"/>
+              </w:rPr>
+              <w:t>bobette.riner@ipgdirect.com</w:t>
+            </w:r>
+          </w:p>
+        </w:tc>
+        <w:tc>
+          <w:tcPr>
+            <w:tcW w:type="dxa" w:w="1008"/>
+          </w:tcPr>
+          <w:p>
+            <w:r/>
+            <w:r>
+              <w:rPr>
+                <w:sz w:val="19"/>
+              </w:rPr>
+              <w:t>0</w:t>
+            </w:r>
+          </w:p>
+        </w:tc>
+      </w:tr>
+      <w:tr>
+        <w:tc>
+          <w:tcPr>
+            <w:tcW w:type="dxa" w:w="720"/>
+          </w:tcPr>
+          <w:p>
+            <w:r/>
+            <w:r>
+              <w:rPr>
+                <w:sz w:val="19"/>
+              </w:rPr>
+              <w:t>2</w:t>
+            </w:r>
+          </w:p>
+        </w:tc>
+        <w:tc>
+          <w:tcPr>
+            <w:tcW w:type="dxa" w:w="3024"/>
+          </w:tcPr>
+          <w:p>
+            <w:r/>
+            <w:r>
+              <w:rPr>
+                <w:sz w:val="19"/>
+              </w:rPr>
               <w:t>eric.bass@enron.com</w:t>
             </w:r>
           </w:p>
@@ -770,7 +797,7 @@
               <w:rPr>
                 <w:sz w:val="19"/>
               </w:rPr>
-              <w:t>12</w:t>
+              <w:t>3</w:t>
             </w:r>
           </w:p>
         </w:tc>
@@ -784,7 +811,7 @@
               <w:rPr>
                 <w:sz w:val="19"/>
               </w:rPr>
-              <w:t>johnny.palmer@enron.com</w:t>
+              <w:t>don.baughman@enron.com</w:t>
             </w:r>
           </w:p>
         </w:tc>
@@ -814,7 +841,7 @@
               <w:rPr>
                 <w:sz w:val="19"/>
               </w:rPr>
-              <w:t>2</w:t>
+              <w:t>3</w:t>
             </w:r>
           </w:p>
         </w:tc>
@@ -842,79 +869,7 @@
               <w:rPr>
                 <w:sz w:val="19"/>
               </w:rPr>
-              <w:t>12</w:t>
-            </w:r>
-          </w:p>
-        </w:tc>
-        <w:tc>
-          <w:tcPr>
-            <w:tcW w:type="dxa" w:w="3024"/>
-          </w:tcPr>
-          <w:p>
-            <w:r/>
-            <w:r>
-              <w:rPr>
-                <w:sz w:val="19"/>
-              </w:rPr>
-              <w:t>bobette.riner@ipgdirect.com</w:t>
-            </w:r>
-          </w:p>
-        </w:tc>
-        <w:tc>
-          <w:tcPr>
-            <w:tcW w:type="dxa" w:w="1008"/>
-          </w:tcPr>
-          <w:p>
-            <w:r/>
-            <w:r>
-              <w:rPr>
-                <w:sz w:val="19"/>
-              </w:rPr>
               <w:t>3</w:t>
-            </w:r>
-          </w:p>
-        </w:tc>
-      </w:tr>
-      <w:tr>
-        <w:tc>
-          <w:tcPr>
-            <w:tcW w:type="dxa" w:w="720"/>
-          </w:tcPr>
-          <w:p>
-            <w:r/>
-            <w:r>
-              <w:rPr>
-                <w:sz w:val="19"/>
-              </w:rPr>
-              <w:t>3</w:t>
-            </w:r>
-          </w:p>
-        </w:tc>
-        <w:tc>
-          <w:tcPr>
-            <w:tcW w:type="dxa" w:w="3024"/>
-          </w:tcPr>
-          <w:p>
-            <w:r/>
-            <w:r>
-              <w:rPr>
-                <w:sz w:val="19"/>
-              </w:rPr>
-              <w:t>lydia.delgado@enron.com</w:t>
-            </w:r>
-          </w:p>
-        </w:tc>
-        <w:tc>
-          <w:tcPr>
-            <w:tcW w:type="dxa" w:w="1008"/>
-          </w:tcPr>
-          <w:p>
-            <w:r/>
-            <w:r>
-              <w:rPr>
-                <w:sz w:val="19"/>
-              </w:rPr>
-              <w:t>10</w:t>
             </w:r>
           </w:p>
         </w:tc>
@@ -942,7 +897,7 @@
               <w:rPr>
                 <w:sz w:val="19"/>
               </w:rPr>
-              <w:t>4</w:t>
+              <w:t>1</w:t>
             </w:r>
           </w:p>
         </w:tc>
@@ -1031,7 +986,7 @@
               <w:rPr>
                 <w:sz w:val="19"/>
               </w:rPr>
-              <w:t>john.arnold@enron.com</w:t>
+              <w:t>bobette.riner@ipgdirect.com</w:t>
             </w:r>
           </w:p>
         </w:tc>
@@ -1045,7 +1000,51 @@
               <w:rPr>
                 <w:sz w:val="19"/>
               </w:rPr>
-              <w:t>13</w:t>
+              <w:t>12</w:t>
+            </w:r>
+          </w:p>
+        </w:tc>
+        <w:tc>
+          <w:tcPr>
+            <w:tcW w:type="dxa" w:w="2592"/>
+          </w:tcPr>
+          <w:p>
+            <w:r/>
+            <w:r>
+              <w:rPr>
+                <w:sz w:val="19"/>
+              </w:rPr>
+              <w:t>8</w:t>
+            </w:r>
+          </w:p>
+        </w:tc>
+      </w:tr>
+      <w:tr>
+        <w:tc>
+          <w:tcPr>
+            <w:tcW w:type="dxa" w:w="3744"/>
+          </w:tcPr>
+          <w:p>
+            <w:r/>
+            <w:r>
+              <w:rPr>
+                <w:sz w:val="19"/>
+              </w:rPr>
+              <w:t>eric.bass@enron.com</w:t>
+            </w:r>
+          </w:p>
+        </w:tc>
+        <w:tc>
+          <w:tcPr>
+            <w:tcW w:type="dxa" w:w="2592"/>
+          </w:tcPr>
+          <w:p>
+            <w:r/>
+            <w:r>
+              <w:rPr>
+                <w:sz w:val="19"/>
+              </w:rPr>
+              <w:t>10</w:t>
             </w:r>
           </w:p>
         </w:tc>
@@ -1103,7 +1102,7 @@
               <w:rPr>
                 <w:sz w:val="19"/>
               </w:rPr>
-              <w:t>4</w:t>
+              <w:t>2</w:t>
             </w:r>
           </w:p>
         </w:tc>
@@ -1119,7 +1118,7 @@
               <w:rPr>
                 <w:sz w:val="19"/>
               </w:rPr>
-              <w:t>eric.bass@enron.com</w:t>
+              <w:t>johnny.palmer@enron.com</w:t>
             </w:r>
           </w:p>
         </w:tc>
@@ -1147,7 +1146,7 @@
               <w:rPr>
                 <w:sz w:val="19"/>
               </w:rPr>
-              <w:t>8</w:t>
+              <w:t>6</w:t>
             </w:r>
           </w:p>
         </w:tc>
@@ -1163,7 +1162,7 @@
               <w:rPr>
                 <w:sz w:val="19"/>
               </w:rPr>
-              <w:t>don.baughman@enron.com</w:t>
+              <w:t>sally.beck@enron.com</w:t>
             </w:r>
           </w:p>
         </w:tc>
@@ -1177,7 +1176,51 @@
               <w:rPr>
                 <w:sz w:val="19"/>
               </w:rPr>
-              <w:t>8</w:t>
+              <w:t>7</w:t>
+            </w:r>
+          </w:p>
+        </w:tc>
+        <w:tc>
+          <w:tcPr>
+            <w:tcW w:type="dxa" w:w="2592"/>
+          </w:tcPr>
+          <w:p>
+            <w:r/>
+            <w:r>
+              <w:rPr>
+                <w:sz w:val="19"/>
+              </w:rPr>
+              <w:t>5</w:t>
+            </w:r>
+          </w:p>
+        </w:tc>
+      </w:tr>
+      <w:tr>
+        <w:tc>
+          <w:tcPr>
+            <w:tcW w:type="dxa" w:w="3744"/>
+          </w:tcPr>
+          <w:p>
+            <w:r/>
+            <w:r>
+              <w:rPr>
+                <w:sz w:val="19"/>
+              </w:rPr>
+              <w:t>kayne.coulter@enron.com</w:t>
+            </w:r>
+          </w:p>
+        </w:tc>
+        <w:tc>
+          <w:tcPr>
+            <w:tcW w:type="dxa" w:w="2592"/>
+          </w:tcPr>
+          <w:p>
+            <w:r/>
+            <w:r>
+              <w:rPr>
+                <w:sz w:val="19"/>
+              </w:rPr>
+              <w:t>6</w:t>
             </w:r>
           </w:p>
         </w:tc>
@@ -1221,7 +1264,7 @@
               <w:rPr>
                 <w:sz w:val="19"/>
               </w:rPr>
-              <w:t>8</w:t>
+              <w:t>6</w:t>
             </w:r>
           </w:p>
         </w:tc>
@@ -1235,7 +1278,7 @@
               <w:rPr>
                 <w:sz w:val="19"/>
               </w:rPr>
-              <w:t>5</w:t>
+              <w:t>6</w:t>
             </w:r>
           </w:p>
         </w:tc>
@@ -1251,7 +1294,7 @@
               <w:rPr>
                 <w:sz w:val="19"/>
               </w:rPr>
-              <w:t>bobette.riner@ipgdirect.com</w:t>
+              <w:t>john.arnold@enron.com</w:t>
             </w:r>
           </w:p>
         </w:tc>
@@ -1265,95 +1308,7 @@
               <w:rPr>
                 <w:sz w:val="19"/>
               </w:rPr>
-              <w:t>7</w:t>
-            </w:r>
-          </w:p>
-        </w:tc>
-        <w:tc>
-          <w:tcPr>
-            <w:tcW w:type="dxa" w:w="2592"/>
-          </w:tcPr>
-          <w:p>
-            <w:r/>
-            <w:r>
-              <w:rPr>
-                <w:sz w:val="19"/>
-              </w:rPr>
-              <w:t>9</w:t>
-            </w:r>
-          </w:p>
-        </w:tc>
-      </w:tr>
-      <w:tr>
-        <w:tc>
-          <w:tcPr>
-            <w:tcW w:type="dxa" w:w="3744"/>
-          </w:tcPr>
-          <w:p>
-            <w:r/>
-            <w:r>
-              <w:rPr>
-                <w:sz w:val="19"/>
-              </w:rPr>
-              <w:t>johnny.palmer@enron.com</w:t>
-            </w:r>
-          </w:p>
-        </w:tc>
-        <w:tc>
-          <w:tcPr>
-            <w:tcW w:type="dxa" w:w="2592"/>
-          </w:tcPr>
-          <w:p>
-            <w:r/>
-            <w:r>
-              <w:rPr>
-                <w:sz w:val="19"/>
-              </w:rPr>
-              <w:t>5</w:t>
-            </w:r>
-          </w:p>
-        </w:tc>
-        <w:tc>
-          <w:tcPr>
-            <w:tcW w:type="dxa" w:w="2592"/>
-          </w:tcPr>
-          <w:p>
-            <w:r/>
-            <w:r>
-              <w:rPr>
-                <w:sz w:val="19"/>
-              </w:rPr>
-              <w:t>7</w:t>
-            </w:r>
-          </w:p>
-        </w:tc>
-      </w:tr>
-      <w:tr>
-        <w:tc>
-          <w:tcPr>
-            <w:tcW w:type="dxa" w:w="3744"/>
-          </w:tcPr>
-          <w:p>
-            <w:r/>
-            <w:r>
-              <w:rPr>
-                <w:sz w:val="19"/>
-              </w:rPr>
-              <w:t>kayne.coulter@enron.com</w:t>
-            </w:r>
-          </w:p>
-        </w:tc>
-        <w:tc>
-          <w:tcPr>
-            <w:tcW w:type="dxa" w:w="2592"/>
-          </w:tcPr>
-          <w:p>
-            <w:r/>
-            <w:r>
-              <w:rPr>
-                <w:sz w:val="19"/>
-              </w:rPr>
-              <w:t>4</w:t>
+              <w:t>6</w:t>
             </w:r>
           </w:p>
         </w:tc>
@@ -1383,65 +1338,7 @@
               <w:rPr>
                 <w:sz w:val="19"/>
               </w:rPr>
-              <w:t>rhonda.denton@enron.com</w:t>
-            </w:r>
-          </w:p>
-        </w:tc>
-        <w:tc>
-          <w:tcPr>
-            <w:tcW w:type="dxa" w:w="2592"/>
-          </w:tcPr>
-          <w:p>
-            <w:r/>
-            <w:r>
-              <w:rPr>
-                <w:sz w:val="19"/>
-              </w:rPr>
-              <w:t>4</w:t>
-            </w:r>
-          </w:p>
-        </w:tc>
-        <w:tc>
-          <w:tcPr>
-            <w:tcW w:type="dxa" w:w="2592"/>
-          </w:tcPr>
-          <w:p>
-            <w:r/>
-            <w:r>
-              <w:rPr>
-                <w:sz w:val="19"/>
-              </w:rPr>
-              <w:t>7</w:t>
-            </w:r>
-          </w:p>
-        </w:tc>
-      </w:tr>
-      <w:tr>
-        <w:tc>
-          <w:tcPr>
-            <w:tcW w:type="dxa" w:w="3744"/>
-          </w:tcPr>
-          <w:p>
-            <w:r/>
-            <w:r>
-              <w:rPr>
-                <w:sz w:val="19"/>
-              </w:rPr>
-              <w:t>sally.beck@enron.com</w:t>
-            </w:r>
-          </w:p>
-        </w:tc>
-        <w:tc>
-          <w:tcPr>
-            <w:tcW w:type="dxa" w:w="2592"/>
-          </w:tcPr>
-          <w:p>
-            <w:r/>
-            <w:r>
-              <w:rPr>
-                <w:sz w:val="19"/>
-              </w:rPr>
-              <w:t>4</w:t>
+              <w:t>don.baughman@enron.com</w:t>
             </w:r>
           </w:p>
         </w:tc>
@@ -1459,6 +1356,64 @@
             </w:r>
           </w:p>
         </w:tc>
+        <w:tc>
+          <w:tcPr>
+            <w:tcW w:type="dxa" w:w="2592"/>
+          </w:tcPr>
+          <w:p>
+            <w:r/>
+            <w:r>
+              <w:rPr>
+                <w:sz w:val="19"/>
+              </w:rPr>
+              <w:t>12</w:t>
+            </w:r>
+          </w:p>
+        </w:tc>
+      </w:tr>
+      <w:tr>
+        <w:tc>
+          <w:tcPr>
+            <w:tcW w:type="dxa" w:w="3744"/>
+          </w:tcPr>
+          <w:p>
+            <w:r/>
+            <w:r>
+              <w:rPr>
+                <w:sz w:val="19"/>
+              </w:rPr>
+              <w:t>rhonda.denton@enron.com</w:t>
+            </w:r>
+          </w:p>
+        </w:tc>
+        <w:tc>
+          <w:tcPr>
+            <w:tcW w:type="dxa" w:w="2592"/>
+          </w:tcPr>
+          <w:p>
+            <w:r/>
+            <w:r>
+              <w:rPr>
+                <w:sz w:val="19"/>
+              </w:rPr>
+              <w:t>1</w:t>
+            </w:r>
+          </w:p>
+        </w:tc>
+        <w:tc>
+          <w:tcPr>
+            <w:tcW w:type="dxa" w:w="2592"/>
+          </w:tcPr>
+          <w:p>
+            <w:r/>
+            <w:r>
+              <w:rPr>
+                <w:sz w:val="19"/>
+              </w:rPr>
+              <w:t>6</w:t>
+            </w:r>
+          </w:p>
+        </w:tc>
       </w:tr>
     </w:tbl>
     <w:p/>
@@ -1473,7 +1428,7 @@
         <w:t>Latest month (2011-12):</w:t>
       </w:r>
       <w:r>
-        <w:t xml:space="preserve"> top positive: eric.bass@enron.com (12), patti.thompson@enron.com (12), lydia.delgado@enron.com (10). Top negative: johnny.palmer@enron.com (1), bobette.riner@ipgdirect.com (3), john.arnold@enron.com (4). Ties are broken alphabetically.</w:t>
+        <w:t xml:space="preserve"> top positive: kayne.coulter@enron.com (4), eric.bass@enron.com (3), patti.thompson@enron.com (3). Top negative: bobette.riner@ipgdirect.com (0), don.baughman@enron.com (1), john.arnold@enron.com (1). Ties are broken alphabetically.</w:t>
       </w:r>
     </w:p>
     <w:p>
@@ -1487,7 +1442,7 @@
         <w:t>Consistency across 24 months:</w:t>
       </w:r>
       <w:r>
-        <w:t xml:space="preserve"> john.arnold@enron.com is in the monthly top-3 positive most often (13 months). don.baughman@enron.com and kayne.coulter@enron.com appear in the top-3 negative most often (11 months).</w:t>
+        <w:t xml:space="preserve"> bobette.riner@ipgdirect.com is in the monthly top-3 positive most often (12 months). don.baughman@enron.com appears in the top-3 negative most often (12 months).</w:t>
       </w:r>
     </w:p>
     <w:p>
@@ -1495,14 +1450,14 @@
         <w:pStyle w:val="ListBullet"/>
       </w:pPr>
       <w:r>
-        <w:t>Rankings partly reflect volume: the score is a sum, so prolific writers rank higher. The whole-period leader is lydia.delgado@enron.com (+187).</w:t>
+        <w:t>Rankings partly reflect volume: the score is a sum, so prolific writers rank higher. The whole-period leader is johnny.palmer@enron.com (+52).</w:t>
       </w:r>
     </w:p>
     <w:p>
       <w:r>
         <w:drawing>
           <wp:inline xmlns:a="http://schemas.openxmlformats.org/drawingml/2006/main" xmlns:pic="http://schemas.openxmlformats.org/drawingml/2006/picture">
-            <wp:extent cx="5760720" cy="2543494"/>
+            <wp:extent cx="5760720" cy="2527820"/>
             <wp:docPr id="4" name="Picture 4"/>
             <wp:cNvGraphicFramePr>
               <a:graphicFrameLocks noChangeAspect="1"/>
@@ -1523,7 +1478,7 @@
                   <pic:spPr>
                     <a:xfrm>
                       <a:off x="0" y="0"/>
-                      <a:ext cx="5760720" cy="2543494"/>
+                      <a:ext cx="5760720" cy="2527820"/>
                     </a:xfrm>
                     <a:prstGeom prst="rect"/>
                   </pic:spPr>
@@ -1547,7 +1502,7 @@
       <w:r>
         <w:drawing>
           <wp:inline xmlns:a="http://schemas.openxmlformats.org/drawingml/2006/main" xmlns:pic="http://schemas.openxmlformats.org/drawingml/2006/picture">
-            <wp:extent cx="5760720" cy="2189312"/>
+            <wp:extent cx="5760720" cy="2179171"/>
             <wp:docPr id="5" name="Picture 5"/>
             <wp:cNvGraphicFramePr>
               <a:graphicFrameLocks noChangeAspect="1"/>
@@ -1568,7 +1523,7 @@
                   <pic:spPr>
                     <a:xfrm>
                       <a:off x="0" y="0"/>
-                      <a:ext cx="5760720" cy="2189312"/>
+                      <a:ext cx="5760720" cy="2179171"/>
                     </a:xfrm>
                     <a:prstGeom prst="rect"/>
                   </pic:spPr>
@@ -1606,7 +1561,7 @@
         <w:rPr>
           <w:b/>
         </w:rPr>
-        <w:t>Table 3 — 7 flagged employees.</w:t>
+        <w:t>Table 3 — 4 flagged employees.</w:t>
       </w:r>
     </w:p>
     <w:tbl>
@@ -1717,79 +1672,7 @@
               <w:rPr>
                 <w:sz w:val="19"/>
               </w:rPr>
-              <w:t>sally.beck@enron.com</w:t>
-            </w:r>
-          </w:p>
-        </w:tc>
-        <w:tc>
-          <w:tcPr>
-            <w:tcW w:type="dxa" w:w="1584"/>
-          </w:tcPr>
-          <w:p>
-            <w:r/>
-            <w:r>
-              <w:rPr>
-                <w:sz w:val="19"/>
-              </w:rPr>
-              <w:t>5</w:t>
-            </w:r>
-          </w:p>
-        </w:tc>
-        <w:tc>
-          <w:tcPr>
-            <w:tcW w:type="dxa" w:w="1728"/>
-          </w:tcPr>
-          <w:p>
-            <w:r/>
-            <w:r>
-              <w:rPr>
-                <w:sz w:val="19"/>
-              </w:rPr>
-              <w:t>2011-08-06</w:t>
-            </w:r>
-          </w:p>
-        </w:tc>
-        <w:tc>
-          <w:tcPr>
-            <w:tcW w:type="dxa" w:w="1152"/>
-          </w:tcPr>
-          <w:p>
-            <w:r/>
-            <w:r>
-              <w:rPr>
-                <w:sz w:val="19"/>
-              </w:rPr>
-              <w:t>2</w:t>
-            </w:r>
-          </w:p>
-        </w:tc>
-        <w:tc>
-          <w:tcPr>
-            <w:tcW w:type="dxa" w:w="1296"/>
-          </w:tcPr>
-          <w:p>
-            <w:r/>
-            <w:r>
-              <w:rPr>
-                <w:sz w:val="19"/>
-              </w:rPr>
-              <w:t>25</w:t>
-            </w:r>
-          </w:p>
-        </w:tc>
-      </w:tr>
-      <w:tr>
-        <w:tc>
-          <w:tcPr>
-            <w:tcW w:type="dxa" w:w="3744"/>
-          </w:tcPr>
-          <w:p>
-            <w:r/>
-            <w:r>
-              <w:rPr>
-                <w:sz w:val="19"/>
-              </w:rPr>
-              <w:t>bobette.riner@ipgdirect.com</w:t>
+              <w:t>john.arnold@enron.com</w:t>
             </w:r>
           </w:p>
         </w:tc>
@@ -1817,7 +1700,7 @@
               <w:rPr>
                 <w:sz w:val="19"/>
               </w:rPr>
-              <w:t>2011-03-26</w:t>
+              <w:t>2010-06-06</w:t>
             </w:r>
           </w:p>
         </w:tc>
@@ -1831,7 +1714,7 @@
               <w:rPr>
                 <w:sz w:val="19"/>
               </w:rPr>
-              <w:t>1</w:t>
+              <w:t>2</w:t>
             </w:r>
           </w:p>
         </w:tc>
@@ -1861,7 +1744,7 @@
               <w:rPr>
                 <w:sz w:val="19"/>
               </w:rPr>
-              <w:t>eric.bass@enron.com</w:t>
+              <w:t>patti.thompson@enron.com</w:t>
             </w:r>
           </w:p>
         </w:tc>
@@ -1889,7 +1772,7 @@
               <w:rPr>
                 <w:sz w:val="19"/>
               </w:rPr>
-              <w:t>2011-04-22</w:t>
+              <w:t>2010-10-04</w:t>
             </w:r>
           </w:p>
         </w:tc>
@@ -1903,7 +1786,7 @@
               <w:rPr>
                 <w:sz w:val="19"/>
               </w:rPr>
-              <w:t>2</w:t>
+              <w:t>1</w:t>
             </w:r>
           </w:p>
         </w:tc>
@@ -1917,7 +1800,7 @@
               <w:rPr>
                 <w:sz w:val="19"/>
               </w:rPr>
-              <w:t>15</w:t>
+              <w:t>17</w:t>
             </w:r>
           </w:p>
         </w:tc>
@@ -1933,7 +1816,7 @@
               <w:rPr>
                 <w:sz w:val="19"/>
               </w:rPr>
-              <w:t>john.arnold@enron.com</w:t>
+              <w:t>rhonda.denton@enron.com</w:t>
             </w:r>
           </w:p>
         </w:tc>
@@ -1961,7 +1844,7 @@
               <w:rPr>
                 <w:sz w:val="19"/>
               </w:rPr>
-              <w:t>2010-05-25</w:t>
+              <w:t>2010-12-24</w:t>
             </w:r>
           </w:p>
         </w:tc>
@@ -2005,7 +1888,7 @@
               <w:rPr>
                 <w:sz w:val="19"/>
               </w:rPr>
-              <w:t>johnny.palmer@enron.com</w:t>
+              <w:t>sally.beck@enron.com</w:t>
             </w:r>
           </w:p>
         </w:tc>
@@ -2033,79 +1916,7 @@
               <w:rPr>
                 <w:sz w:val="19"/>
               </w:rPr>
-              <w:t>2010-02-09</w:t>
-            </w:r>
-          </w:p>
-        </w:tc>
-        <w:tc>
-          <w:tcPr>
-            <w:tcW w:type="dxa" w:w="1152"/>
-          </w:tcPr>
-          <w:p>
-            <w:r/>
-            <w:r>
-              <w:rPr>
-                <w:sz w:val="19"/>
-              </w:rPr>
-              <w:t>2</w:t>
-            </w:r>
-          </w:p>
-        </w:tc>
-        <w:tc>
-          <w:tcPr>
-            <w:tcW w:type="dxa" w:w="1296"/>
-          </w:tcPr>
-          <w:p>
-            <w:r/>
-            <w:r>
-              <w:rPr>
-                <w:sz w:val="19"/>
-              </w:rPr>
-              <w:t>21</w:t>
-            </w:r>
-          </w:p>
-        </w:tc>
-      </w:tr>
-      <w:tr>
-        <w:tc>
-          <w:tcPr>
-            <w:tcW w:type="dxa" w:w="3744"/>
-          </w:tcPr>
-          <w:p>
-            <w:r/>
-            <w:r>
-              <w:rPr>
-                <w:sz w:val="19"/>
-              </w:rPr>
-              <w:t>kayne.coulter@enron.com</w:t>
-            </w:r>
-          </w:p>
-        </w:tc>
-        <w:tc>
-          <w:tcPr>
-            <w:tcW w:type="dxa" w:w="1584"/>
-          </w:tcPr>
-          <w:p>
-            <w:r/>
-            <w:r>
-              <w:rPr>
-                <w:sz w:val="19"/>
-              </w:rPr>
-              <w:t>4</w:t>
-            </w:r>
-          </w:p>
-        </w:tc>
-        <w:tc>
-          <w:tcPr>
-            <w:tcW w:type="dxa" w:w="1728"/>
-          </w:tcPr>
-          <w:p>
-            <w:r/>
-            <w:r>
-              <w:rPr>
-                <w:sz w:val="19"/>
-              </w:rPr>
-              <w:t>2010-04-06</w:t>
+              <w:t>2010-12-15</w:t>
             </w:r>
           </w:p>
         </w:tc>
@@ -2133,79 +1944,7 @@
               <w:rPr>
                 <w:sz w:val="19"/>
               </w:rPr>
-              <w:t>18</w:t>
-            </w:r>
-          </w:p>
-        </w:tc>
-      </w:tr>
-      <w:tr>
-        <w:tc>
-          <w:tcPr>
-            <w:tcW w:type="dxa" w:w="3744"/>
-          </w:tcPr>
-          <w:p>
-            <w:r/>
-            <w:r>
-              <w:rPr>
-                <w:sz w:val="19"/>
-              </w:rPr>
-              <w:t>patti.thompson@enron.com</w:t>
-            </w:r>
-          </w:p>
-        </w:tc>
-        <w:tc>
-          <w:tcPr>
-            <w:tcW w:type="dxa" w:w="1584"/>
-          </w:tcPr>
-          <w:p>
-            <w:r/>
-            <w:r>
-              <w:rPr>
-                <w:sz w:val="19"/>
-              </w:rPr>
-              <w:t>4</w:t>
-            </w:r>
-          </w:p>
-        </w:tc>
-        <w:tc>
-          <w:tcPr>
-            <w:tcW w:type="dxa" w:w="1728"/>
-          </w:tcPr>
-          <w:p>
-            <w:r/>
-            <w:r>
-              <w:rPr>
-                <w:sz w:val="19"/>
-              </w:rPr>
-              <w:t>2011-07-02</w:t>
-            </w:r>
-          </w:p>
-        </w:tc>
-        <w:tc>
-          <w:tcPr>
-            <w:tcW w:type="dxa" w:w="1152"/>
-          </w:tcPr>
-          <w:p>
-            <w:r/>
-            <w:r>
-              <w:rPr>
-                <w:sz w:val="19"/>
-              </w:rPr>
-              <w:t>1</w:t>
-            </w:r>
-          </w:p>
-        </w:tc>
-        <w:tc>
-          <w:tcPr>
-            <w:tcW w:type="dxa" w:w="1296"/>
-          </w:tcPr>
-          <w:p>
-            <w:r/>
-            <w:r>
-              <w:rPr>
-                <w:sz w:val="19"/>
-              </w:rPr>
-              <w:t>20</w:t>
+              <w:t>17</w:t>
             </w:r>
           </w:p>
         </w:tc>
@@ -2220,10 +1959,10 @@
         <w:rPr>
           <w:b/>
         </w:rPr>
-        <w:t>7 of 10 employees are flagged</w:t>
+        <w:t>4 of 10 employees are flagged</w:t>
       </w:r>
       <w:r>
-        <w:t xml:space="preserve"> (max negatives in one 30-day window): sally.beck@enron.com (5), bobette.riner@ipgdirect.com (4), eric.bass@enron.com (4), john.arnold@enron.com (4), johnny.palmer@enron.com (4), kayne.coulter@enron.com (4), patti.thompson@enron.com (4).</w:t>
+        <w:t xml:space="preserve"> (max negatives in one 30-day window): john.arnold@enron.com (4), patti.thompson@enron.com (4), rhonda.denton@enron.com (4), sally.beck@enron.com (4).</w:t>
       </w:r>
     </w:p>
     <w:p>
@@ -2237,7 +1976,7 @@
         <w:rPr>
           <w:b/>
         </w:rPr>
-        <w:t>4</w:t>
+        <w:t>2</w:t>
       </w:r>
       <w:r>
         <w:t xml:space="preserve">. The rolling window adds </w:t>
@@ -2246,7 +1985,7 @@
         <w:rPr>
           <w:b/>
         </w:rPr>
-        <w:t>bobette.riner@ipgdirect.com, john.arnold@enron.com and johnny.palmer@enron.com</w:t>
+        <w:t>rhonda.denton@enron.com and sally.beck@enron.com</w:t>
       </w:r>
       <w:r>
         <w:t>, whose negative bursts straddle a month boundary. This is why the brief specifies a rolling window.</w:t>
@@ -2274,7 +2013,7 @@
       <w:r>
         <w:drawing>
           <wp:inline xmlns:a="http://schemas.openxmlformats.org/drawingml/2006/main" xmlns:pic="http://schemas.openxmlformats.org/drawingml/2006/picture">
-            <wp:extent cx="5029200" cy="2661913"/>
+            <wp:extent cx="5029200" cy="2563313"/>
             <wp:docPr id="6" name="Picture 6"/>
             <wp:cNvGraphicFramePr>
               <a:graphicFrameLocks noChangeAspect="1"/>
@@ -2295,7 +2034,7 @@
                   <pic:spPr>
                     <a:xfrm>
                       <a:off x="0" y="0"/>
-                      <a:ext cx="5029200" cy="2661913"/>
+                      <a:ext cx="5029200" cy="2563313"/>
                     </a:xfrm>
                     <a:prstGeom prst="rect"/>
                   </pic:spPr>
@@ -2407,7 +2146,7 @@
               <w:rPr>
                 <w:sz w:val="19"/>
               </w:rPr>
-              <w:t>0.816</w:t>
+              <w:t>0.254</w:t>
             </w:r>
           </w:p>
         </w:tc>
@@ -2437,7 +2176,7 @@
               <w:rPr>
                 <w:sz w:val="19"/>
               </w:rPr>
-              <w:t>0.823</w:t>
+              <w:t>0.355</w:t>
             </w:r>
           </w:p>
         </w:tc>
@@ -2467,7 +2206,7 @@
               <w:rPr>
                 <w:sz w:val="19"/>
               </w:rPr>
-              <w:t>1.37</w:t>
+              <w:t>1.26</w:t>
             </w:r>
           </w:p>
         </w:tc>
@@ -2497,7 +2236,7 @@
               <w:rPr>
                 <w:sz w:val="19"/>
               </w:rPr>
-              <w:t>1.79</w:t>
+              <w:t>1.74</w:t>
             </w:r>
           </w:p>
         </w:tc>
@@ -2527,7 +2266,7 @@
               <w:rPr>
                 <w:sz w:val="19"/>
               </w:rPr>
-              <w:t>3.57</w:t>
+              <w:t>1.67</w:t>
             </w:r>
           </w:p>
         </w:tc>
@@ -2557,7 +2296,7 @@
               <w:rPr>
                 <w:sz w:val="19"/>
               </w:rPr>
-              <w:t>4.25</w:t>
+              <w:t>2.17</w:t>
             </w:r>
           </w:p>
         </w:tc>
@@ -2587,7 +2326,7 @@
               <w:rPr>
                 <w:sz w:val="19"/>
               </w:rPr>
-              <w:t>0.800 ± 0.033</w:t>
+              <w:t>0.210 ± 0.116</w:t>
             </w:r>
           </w:p>
         </w:tc>
@@ -2659,6 +2398,36 @@
               <w:rPr>
                 <w:sz w:val="19"/>
               </w:rPr>
+              <w:t>avg_char_length</w:t>
+            </w:r>
+          </w:p>
+        </w:tc>
+        <w:tc>
+          <w:tcPr>
+            <w:tcW w:type="dxa" w:w="2880"/>
+          </w:tcPr>
+          <w:p>
+            <w:r/>
+            <w:r>
+              <w:rPr>
+                <w:sz w:val="19"/>
+              </w:rPr>
+              <w:t>-0.389</w:t>
+            </w:r>
+          </w:p>
+        </w:tc>
+      </w:tr>
+      <w:tr>
+        <w:tc>
+          <w:tcPr>
+            <w:tcW w:type="dxa" w:w="3600"/>
+          </w:tcPr>
+          <w:p>
+            <w:r/>
+            <w:r>
+              <w:rPr>
+                <w:sz w:val="19"/>
+              </w:rPr>
               <w:t>message_count</w:t>
             </w:r>
           </w:p>
@@ -2673,7 +2442,97 @@
               <w:rPr>
                 <w:sz w:val="19"/>
               </w:rPr>
-              <w:t>4.115</w:t>
+              <w:t>0.315</w:t>
+            </w:r>
+          </w:p>
+        </w:tc>
+      </w:tr>
+      <w:tr>
+        <w:tc>
+          <w:tcPr>
+            <w:tcW w:type="dxa" w:w="3600"/>
+          </w:tcPr>
+          <w:p>
+            <w:r/>
+            <w:r>
+              <w:rPr>
+                <w:sz w:val="19"/>
+              </w:rPr>
+              <w:t>avg_word_count</w:t>
+            </w:r>
+          </w:p>
+        </w:tc>
+        <w:tc>
+          <w:tcPr>
+            <w:tcW w:type="dxa" w:w="2880"/>
+          </w:tcPr>
+          <w:p>
+            <w:r/>
+            <w:r>
+              <w:rPr>
+                <w:sz w:val="19"/>
+              </w:rPr>
+              <w:t>0.296</w:t>
+            </w:r>
+          </w:p>
+        </w:tc>
+      </w:tr>
+      <w:tr>
+        <w:tc>
+          <w:tcPr>
+            <w:tcW w:type="dxa" w:w="3600"/>
+          </w:tcPr>
+          <w:p>
+            <w:r/>
+            <w:r>
+              <w:rPr>
+                <w:sz w:val="19"/>
+              </w:rPr>
+              <w:t>active_days</w:t>
+            </w:r>
+          </w:p>
+        </w:tc>
+        <w:tc>
+          <w:tcPr>
+            <w:tcW w:type="dxa" w:w="2880"/>
+          </w:tcPr>
+          <w:p>
+            <w:r/>
+            <w:r>
+              <w:rPr>
+                <w:sz w:val="19"/>
+              </w:rPr>
+              <w:t>0.288</w:t>
+            </w:r>
+          </w:p>
+        </w:tc>
+      </w:tr>
+      <w:tr>
+        <w:tc>
+          <w:tcPr>
+            <w:tcW w:type="dxa" w:w="3600"/>
+          </w:tcPr>
+          <w:p>
+            <w:r/>
+            <w:r>
+              <w:rPr>
+                <w:sz w:val="19"/>
+              </w:rPr>
+              <w:t>avg_exclamations</w:t>
+            </w:r>
+          </w:p>
+        </w:tc>
+        <w:tc>
+          <w:tcPr>
+            <w:tcW w:type="dxa" w:w="2880"/>
+          </w:tcPr>
+          <w:p>
+            <w:r/>
+            <w:r>
+              <w:rPr>
+                <w:sz w:val="19"/>
+              </w:rPr>
+              <w:t>0.26</w:t>
             </w:r>
           </w:p>
         </w:tc>
@@ -2703,7 +2562,7 @@
               <w:rPr>
                 <w:sz w:val="19"/>
               </w:rPr>
-              <w:t>-0.45</w:t>
+              <w:t>0.215</w:t>
             </w:r>
           </w:p>
         </w:tc>
@@ -2719,7 +2578,7 @@
               <w:rPr>
                 <w:sz w:val="19"/>
               </w:rPr>
-              <w:t>active_days</w:t>
+              <w:t>month_index</w:t>
             </w:r>
           </w:p>
         </w:tc>
@@ -2733,7 +2592,7 @@
               <w:rPr>
                 <w:sz w:val="19"/>
               </w:rPr>
-              <w:t>-0.385</w:t>
+              <w:t>0.186</w:t>
             </w:r>
           </w:p>
         </w:tc>
@@ -2763,7 +2622,7 @@
               <w:rPr>
                 <w:sz w:val="19"/>
               </w:rPr>
-              <w:t>0.375</w:t>
+              <w:t>-0.088</w:t>
             </w:r>
           </w:p>
         </w:tc>
@@ -2793,127 +2652,7 @@
               <w:rPr>
                 <w:sz w:val="19"/>
               </w:rPr>
-              <w:t>-0.31</w:t>
-            </w:r>
-          </w:p>
-        </w:tc>
-      </w:tr>
-      <w:tr>
-        <w:tc>
-          <w:tcPr>
-            <w:tcW w:type="dxa" w:w="3600"/>
-          </w:tcPr>
-          <w:p>
-            <w:r/>
-            <w:r>
-              <w:rPr>
-                <w:sz w:val="19"/>
-              </w:rPr>
-              <w:t>avg_exclamations</w:t>
-            </w:r>
-          </w:p>
-        </w:tc>
-        <w:tc>
-          <w:tcPr>
-            <w:tcW w:type="dxa" w:w="2880"/>
-          </w:tcPr>
-          <w:p>
-            <w:r/>
-            <w:r>
-              <w:rPr>
-                <w:sz w:val="19"/>
-              </w:rPr>
-              <w:t>0.289</w:t>
-            </w:r>
-          </w:p>
-        </w:tc>
-      </w:tr>
-      <w:tr>
-        <w:tc>
-          <w:tcPr>
-            <w:tcW w:type="dxa" w:w="3600"/>
-          </w:tcPr>
-          <w:p>
-            <w:r/>
-            <w:r>
-              <w:rPr>
-                <w:sz w:val="19"/>
-              </w:rPr>
-              <w:t>month_index</w:t>
-            </w:r>
-          </w:p>
-        </w:tc>
-        <w:tc>
-          <w:tcPr>
-            <w:tcW w:type="dxa" w:w="2880"/>
-          </w:tcPr>
-          <w:p>
-            <w:r/>
-            <w:r>
-              <w:rPr>
-                <w:sz w:val="19"/>
-              </w:rPr>
-              <w:t>0.256</w:t>
-            </w:r>
-          </w:p>
-        </w:tc>
-      </w:tr>
-      <w:tr>
-        <w:tc>
-          <w:tcPr>
-            <w:tcW w:type="dxa" w:w="3600"/>
-          </w:tcPr>
-          <w:p>
-            <w:r/>
-            <w:r>
-              <w:rPr>
-                <w:sz w:val="19"/>
-              </w:rPr>
-              <w:t>avg_word_count</w:t>
-            </w:r>
-          </w:p>
-        </w:tc>
-        <w:tc>
-          <w:tcPr>
-            <w:tcW w:type="dxa" w:w="2880"/>
-          </w:tcPr>
-          <w:p>
-            <w:r/>
-            <w:r>
-              <w:rPr>
-                <w:sz w:val="19"/>
-              </w:rPr>
-              <w:t>0.186</w:t>
-            </w:r>
-          </w:p>
-        </w:tc>
-      </w:tr>
-      <w:tr>
-        <w:tc>
-          <w:tcPr>
-            <w:tcW w:type="dxa" w:w="3600"/>
-          </w:tcPr>
-          <w:p>
-            <w:r/>
-            <w:r>
-              <w:rPr>
-                <w:sz w:val="19"/>
-              </w:rPr>
-              <w:t>avg_char_length</w:t>
-            </w:r>
-          </w:p>
-        </w:tc>
-        <w:tc>
-          <w:tcPr>
-            <w:tcW w:type="dxa" w:w="2880"/>
-          </w:tcPr>
-          <w:p>
-            <w:r/>
-            <w:r>
-              <w:rPr>
-                <w:sz w:val="19"/>
-              </w:rPr>
-              <w:t>-0.017</w:t>
+              <w:t>0.063</w:t>
             </w:r>
           </w:p>
         </w:tc>
@@ -2937,7 +2676,7 @@
         <w:rPr>
           <w:b/>
         </w:rPr>
-        <w:t>0.82</w:t>
+        <w:t>0.35</w:t>
       </w:r>
       <w:r>
         <w:t xml:space="preserve">, MAE = </w:t>
@@ -2946,7 +2685,7 @@
         <w:rPr>
           <w:b/>
         </w:rPr>
-        <w:t>1.37</w:t>
+        <w:t>1.26</w:t>
       </w:r>
       <w:r>
         <w:t xml:space="preserve">, RMSE = </w:t>
@@ -2955,10 +2694,10 @@
         <w:rPr>
           <w:b/>
         </w:rPr>
-        <w:t>1.79</w:t>
+        <w:t>1.74</w:t>
       </w:r>
       <w:r>
-        <w:t>, against a mean-only baseline with MAE 3.57 / RMSE 4.25. 5-fold cross-validation R² = 0.80 ± 0.03. Train R² ≈ test R², so there is no sign of overfitting.</w:t>
+        <w:t>, against a mean-only baseline with MAE 1.67 / RMSE 2.17. 5-fold cross-validation R² = 0.21 ± 0.12. Train R² is 0.25, so some overfitting is present.</w:t>
       </w:r>
     </w:p>
     <w:p>
@@ -2979,13 +2718,10 @@
           <w:rFonts w:ascii="Consolas" w:hAnsi="Consolas"/>
           <w:sz w:val="20"/>
         </w:rPr>
-        <w:t>message_count</w:t>
+        <w:t>avg_char_length</w:t>
       </w:r>
       <w:r>
-        <w:t xml:space="preserve"> (standardised coefficient +4.12).</w:t>
-      </w:r>
-      <w:r>
-        <w:t xml:space="preserve"> The average message scores +0.64, so every extra message moves the monthly score by about that much. The monthly score is largely a function of how much an employee communicates.</w:t>
+        <w:t xml:space="preserve"> (standardised coefficient -0.39).</w:t>
       </w:r>
     </w:p>
     <w:p>
@@ -3000,7 +2736,7 @@
         <w:t>prev_month_score</w:t>
       </w:r>
       <w:r>
-        <w:t xml:space="preserve"> is slightly negative (mild mean reversion); the company-wide average score trends +0.045 points per month.</w:t>
+        <w:t xml:space="preserve"> is positive (sentiment momentum); the company-wide average score trends +0.034 points per month.</w:t>
       </w:r>
     </w:p>
     <w:p>
@@ -3030,7 +2766,7 @@
       <w:r>
         <w:drawing>
           <wp:inline xmlns:a="http://schemas.openxmlformats.org/drawingml/2006/main" xmlns:pic="http://schemas.openxmlformats.org/drawingml/2006/picture">
-            <wp:extent cx="3840480" cy="3934725"/>
+            <wp:extent cx="3840480" cy="3931464"/>
             <wp:docPr id="7" name="Picture 7"/>
             <wp:cNvGraphicFramePr>
               <a:graphicFrameLocks noChangeAspect="1"/>
@@ -3051,7 +2787,7 @@
                   <pic:spPr>
                     <a:xfrm>
                       <a:off x="0" y="0"/>
-                      <a:ext cx="3840480" cy="3934725"/>
+                      <a:ext cx="3840480" cy="3931464"/>
                     </a:xfrm>
                     <a:prstGeom prst="rect"/>
                   </pic:spPr>
@@ -3075,7 +2811,7 @@
       <w:r>
         <w:drawing>
           <wp:inline xmlns:a="http://schemas.openxmlformats.org/drawingml/2006/main" xmlns:pic="http://schemas.openxmlformats.org/drawingml/2006/picture">
-            <wp:extent cx="4572000" cy="2621068"/>
+            <wp:extent cx="4572000" cy="2538694"/>
             <wp:docPr id="8" name="Picture 8"/>
             <wp:cNvGraphicFramePr>
               <a:graphicFrameLocks noChangeAspect="1"/>
@@ -3096,7 +2832,7 @@
                   <pic:spPr>
                     <a:xfrm>
                       <a:off x="0" y="0"/>
-                      <a:ext cx="4572000" cy="2621068"/>
+                      <a:ext cx="4572000" cy="2538694"/>
                     </a:xfrm>
                     <a:prstGeom prst="rect"/>
                   </pic:spPr>
@@ -3120,7 +2856,7 @@
       <w:r>
         <w:drawing>
           <wp:inline xmlns:a="http://schemas.openxmlformats.org/drawingml/2006/main" xmlns:pic="http://schemas.openxmlformats.org/drawingml/2006/picture">
-            <wp:extent cx="5760720" cy="2616621"/>
+            <wp:extent cx="5760720" cy="2595444"/>
             <wp:docPr id="9" name="Picture 9"/>
             <wp:cNvGraphicFramePr>
               <a:graphicFrameLocks noChangeAspect="1"/>
@@ -3141,7 +2877,7 @@
                   <pic:spPr>
                     <a:xfrm>
                       <a:off x="0" y="0"/>
-                      <a:ext cx="5760720" cy="2616621"/>
+                      <a:ext cx="5760720" cy="2595444"/>
                     </a:xfrm>
                     <a:prstGeom prst="rect"/>
                   </pic:spPr>
@@ -3174,7 +2910,7 @@
         <w:pStyle w:val="ListNumber"/>
       </w:pPr>
       <w:r>
-        <w:t xml:space="preserve">Overall sentiment is healthy (71.8% positive). The risk signal comes from short </w:t>
+        <w:t xml:space="preserve">Overall sentiment is mixed (23.7% positive). The risk signal comes from short </w:t>
       </w:r>
       <w:r>
         <w:rPr>
@@ -3197,19 +2933,19 @@
         <w:rPr>
           <w:b/>
         </w:rPr>
-        <w:t>sally.beck@enron.com</w:t>
+        <w:t>john.arnold@enron.com</w:t>
       </w:r>
       <w:r>
-        <w:t xml:space="preserve"> (strongest burst: 5 negatives in 30 days from 2011-08-06) and </w:t>
+        <w:t xml:space="preserve"> (strongest burst: 4 negatives in 30 days from 2010-06-06) and </w:t>
       </w:r>
       <w:r>
         <w:rPr>
           <w:b/>
         </w:rPr>
-        <w:t>don.baughman@enron.com and kayne.coulter@enron.com</w:t>
+        <w:t>don.baughman@enron.com</w:t>
       </w:r>
       <w:r>
-        <w:t xml:space="preserve"> (top-3 negative in 11 of 24 months).</w:t>
+        <w:t xml:space="preserve"> (top-3 negative in 12 of 24 months).</w:t>
       </w:r>
     </w:p>
     <w:p>
@@ -3226,7 +2962,7 @@
         <w:t>rolling-window</w:t>
       </w:r>
       <w:r>
-        <w:t xml:space="preserve"> flag operationally. It catches 3 employee(s) a monthly report would miss.</w:t>
+        <w:t xml:space="preserve"> flag operationally. It catches 2 employee(s) a monthly report would miss.</w:t>
       </w:r>
     </w:p>
     <w:p>

</xml_diff>